<commit_message>
Ajouter l'equipe au rapport et retirer le chemin local
Le rapport indique desormais les cinq membres du groupe G1 sur la page de garde, et ne contient plus le chemin C:\Users\... du poste (remplace par une reference au dossier du projet, dans le rapport et dans MODELE_DATAMART.md §7).

Co-authored-by: Copilot <223556219+Copilot@users.noreply.github.com>
</commit_message>
<xml_diff>
--- a/Rapport_Projet_Solaris_G1.docx
+++ b/Rapport_Projet_Solaris_G1.docx
@@ -367,6 +367,43 @@
                 <w:sz w:val="19"/>
               </w:rPr>
               <w:t>G1 - EFREI</w:t>
+            </w:r>
+          </w:p>
+        </w:tc>
+      </w:tr>
+      <w:tr>
+        <w:tc>
+          <w:tcPr>
+            <w:tcW w:type="dxa" w:w="2551"/>
+          </w:tcPr>
+          <w:p>
+            <w:pPr>
+              <w:spacing w:after="40"/>
+            </w:pPr>
+            <w:r/>
+            <w:r>
+              <w:rPr>
+                <w:b w:val="0"/>
+                <w:sz w:val="19"/>
+              </w:rPr>
+              <w:t>Équipe</w:t>
+            </w:r>
+          </w:p>
+        </w:tc>
+        <w:tc>
+          <w:tcPr>
+            <w:tcW w:type="dxa" w:w="6803"/>
+          </w:tcPr>
+          <w:p>
+            <w:pPr>
+              <w:spacing w:after="40"/>
+            </w:pPr>
+            <w:r/>
+            <w:r>
+              <w:rPr>
+                <w:sz w:val="19"/>
+              </w:rPr>
+              <w:t>Thibeau BENET, Adrien DE TRAZEGNIES D'ITTRE, Maxime DORMIGNIES, Timothé HEGE, Rémi PETIT</w:t>
             </w:r>
           </w:p>
         </w:tc>
@@ -9560,7 +9597,7 @@
           <w:b w:val="0"/>
           <w:sz w:val="21"/>
         </w:rPr>
-        <w:t>Les fichiers source doivent rester à cet emplacement : C:\Users\Lenovo\Desktop\PowerBi\Projet_Solaris\ValeursFoncieres-AAAA.txt (le chemin du dossier est codé dans la requête DVF_Brut).</w:t>
+        <w:t>Les fichiers source doivent rester dans le dossier du projet, nommés ValeursFoncieres-AAAA.txt : le chemin de ce dossier est codé dans l'étape Dossier de la requête DVF_Brut, il est à mettre à jour si le projet est déplacé sur un autre poste.</w:t>
       </w:r>
     </w:p>
     <w:p>

</xml_diff>